<commit_message>
Change in the documentation
</commit_message>
<xml_diff>
--- a/CarRental Pro Dokumentáció.docx
+++ b/CarRental Pro Dokumentáció.docx
@@ -20760,6 +20760,38 @@
           <w:color w:val="1A1A1A"/>
         </w:rPr>
         <w:t>)</w:t>
+      </w:r>
+    </w:p>
+    <w:p>
+      <w:pPr>
+        <w:pStyle w:val="Listaszerbekezds"/>
+        <w:numPr>
+          <w:ilvl w:val="0"/>
+          <w:numId w:val="2"/>
+        </w:numPr>
+        <w:spacing w:before="40" w:after="40"/>
+      </w:pPr>
+      <w:r>
+        <w:rPr>
+          <w:color w:val="1A1A1A"/>
+        </w:rPr>
+        <w:t>Profil megtekintések, profil vélemények</w:t>
+      </w:r>
+    </w:p>
+    <w:p>
+      <w:pPr>
+        <w:pStyle w:val="Listaszerbekezds"/>
+        <w:numPr>
+          <w:ilvl w:val="0"/>
+          <w:numId w:val="2"/>
+        </w:numPr>
+        <w:spacing w:before="40" w:after="40"/>
+      </w:pPr>
+      <w:r>
+        <w:rPr>
+          <w:color w:val="1A1A1A"/>
+        </w:rPr>
+        <w:t>Hibapontok bérlőknek, felhasználóknak</w:t>
       </w:r>
     </w:p>
     <w:p>

</xml_diff>